<commit_message>
docs: manifestes voyages/colis dans le manuel compagnie et l'offre commerciale colis
- Fiche « Rapports Voyages & Manifestes » : onglets Voyages (manifeste passagers PDF/CSV par départ) et Colis autonomes (manifeste filtrable imprimable)
- Fiche Colis autonomes : mention du manifeste
- Offre commerciale : manifeste colis en points clés, paramétrage direction et tableau des bénéfices
</commit_message>
<xml_diff>
--- a/docs/Offre_Commerciale_Module_Colis_Tibus.docx
+++ b/docs/Offre_Commerciale_Module_Colis_Tibus.docx
@@ -556,6 +556,32 @@
     </w:p>
     <w:p>
       <w:pPr>
+        <w:pStyle w:val="ListParagraph"/>
+        <w:numPr>
+          <w:ilvl w:val="0"/>
+          <w:numId w:val="2"/>
+        </w:numPr>
+        <w:spacing w:after="90" w:line="290"/>
+      </w:pPr>
+      <w:r>
+        <w:rPr>
+          <w:b/>
+          <w:bCs/>
+          <w:sz w:val="22"/>
+          <w:szCs w:val="22"/>
+        </w:rPr>
+        <w:t xml:space="preserve">Manifeste colis — </w:t>
+      </w:r>
+      <w:r>
+        <w:rPr>
+          <w:sz w:val="22"/>
+          <w:szCs w:val="22"/>
+        </w:rPr>
+        <w:t xml:space="preserve">Impression en un clic du manifeste des envois (PDF paysage ou Excel), filtrable par statut et gare de départ, avec tous les détails et les totaux de fret.</w:t>
+      </w:r>
+    </w:p>
+    <w:p>
+      <w:pPr>
         <w:pStyle w:val="Heading2"/>
         <w:spacing w:after="140" w:before="260"/>
       </w:pPr>
@@ -640,6 +666,23 @@
     </w:p>
     <w:p>
       <w:pPr>
+        <w:pStyle w:val="ListParagraph"/>
+        <w:numPr>
+          <w:ilvl w:val="0"/>
+          <w:numId w:val="2"/>
+        </w:numPr>
+        <w:spacing w:after="90" w:line="290"/>
+      </w:pPr>
+      <w:r>
+        <w:rPr>
+          <w:sz w:val="22"/>
+          <w:szCs w:val="22"/>
+        </w:rPr>
+        <w:t xml:space="preserve">Manifeste colis : depuis les rapports (onglet Colis autonomes), impression PDF ou export Excel de la liste des envois — date, référence, gares, expéditeur/destinataire et téléphones, natures, poids, pièces, montant, statut — filtrée par statut et gare de départ.</w:t>
+      </w:r>
+    </w:p>
+    <w:p>
+      <w:pPr>
         <w:pStyle w:val="Heading2"/>
         <w:spacing w:after="140" w:before="260"/>
       </w:pPr>
@@ -766,11 +809,6 @@
           <w:szCs w:val="22"/>
         </w:rPr>
         <w:t xml:space="preserve">À chaque étape du voyage, le personnel fait avancer le statut du colis d'un simple bouton ; le système horodate l'opération et envoie le SMS correspondant. À l'arrivée, la remise se fait contre référence ou scan du QR, après vérification de l'identité du destinataire.</w:t>
-      </w:r>
-    </w:p>
-    <w:p>
-      <w:r>
-        <w:br w:type="page"/>
       </w:r>
     </w:p>
     <w:p>
@@ -1087,6 +1125,52 @@
                 <w:szCs w:val="20"/>
               </w:rPr>
               <w:t xml:space="preserve">Volumes, revenus et statuts consultables en temps réel par la direction</w:t>
+            </w:r>
+          </w:p>
+        </w:tc>
+      </w:tr>
+      <w:tr>
+        <w:tc>
+          <w:tcPr>
+            <w:tcW w:type="dxa" w:w="4400"/>
+            <w:tcMar>
+              <w:top w:type="dxa" w:w="80"/>
+              <w:left w:type="dxa" w:w="110"/>
+              <w:bottom w:type="dxa" w:w="80"/>
+              <w:right w:type="dxa" w:w="110"/>
+            </w:tcMar>
+          </w:tcPr>
+          <w:p>
+            <w:r>
+              <w:rPr>
+                <w:b w:val="false"/>
+                <w:bCs w:val="false"/>
+                <w:sz w:val="20"/>
+                <w:szCs w:val="20"/>
+              </w:rPr>
+              <w:t xml:space="preserve">Pas de document de bord pour les colis transportés</w:t>
+            </w:r>
+          </w:p>
+        </w:tc>
+        <w:tc>
+          <w:tcPr>
+            <w:tcW w:type="dxa" w:w="5000"/>
+            <w:tcMar>
+              <w:top w:type="dxa" w:w="80"/>
+              <w:left w:type="dxa" w:w="110"/>
+              <w:bottom w:type="dxa" w:w="80"/>
+              <w:right w:type="dxa" w:w="110"/>
+            </w:tcMar>
+          </w:tcPr>
+          <w:p>
+            <w:r>
+              <w:rPr>
+                <w:b w:val="false"/>
+                <w:bCs w:val="false"/>
+                <w:sz w:val="20"/>
+                <w:szCs w:val="20"/>
+              </w:rPr>
+              <w:t xml:space="preserve">Manifeste colis imprimable (PDF/Excel) avec tous les détails, pour le chargement, le convoyage et les contrôles en route</w:t>
             </w:r>
           </w:p>
         </w:tc>

</xml_diff>

<commit_message>
Statistiques financières livreur (graphiques + export CSV)
</commit_message>
<xml_diff>
--- a/docs/Offre_Commerciale_Module_Colis_Tibus.docx
+++ b/docs/Offre_Commerciale_Module_Colis_Tibus.docx
@@ -473,7 +473,7 @@
           <w:sz w:val="22"/>
           <w:szCs w:val="22"/>
         </w:rPr>
-        <w:t xml:space="preserve">Enregistré → Chargé en soute → Arrivé à destination → Remis au destinataire.</w:t>
+        <w:t xml:space="preserve">Enregistré → Chargé en soute → Arrivé à destination → Remis au destinataire, validé par scan du code QR ou saisie manuelle de la référence.</w:t>
       </w:r>
     </w:p>
     <w:p>
@@ -577,7 +577,33 @@
           <w:sz w:val="22"/>
           <w:szCs w:val="22"/>
         </w:rPr>
-        <w:t xml:space="preserve">Impression en un clic du manifeste des envois (PDF paysage ou Excel), filtrable par statut et gare de départ, avec tous les détails et les totaux de fret.</w:t>
+        <w:t xml:space="preserve">Impression en un clic du manifeste des envois (PDF paysage ou Excel), filtrable par statut, gare de départ et bus / véhicule du convoi, avec tous les détails et les totaux de fret.</w:t>
+      </w:r>
+    </w:p>
+    <w:p>
+      <w:pPr>
+        <w:pStyle w:val="ListParagraph"/>
+        <w:numPr>
+          <w:ilvl w:val="0"/>
+          <w:numId w:val="2"/>
+        </w:numPr>
+        <w:spacing w:after="90" w:line="290"/>
+      </w:pPr>
+      <w:r>
+        <w:rPr>
+          <w:b/>
+          <w:bCs/>
+          <w:sz w:val="22"/>
+          <w:szCs w:val="22"/>
+        </w:rPr>
+        <w:t xml:space="preserve">Bordereau de chargement — </w:t>
+      </w:r>
+      <w:r>
+        <w:rPr>
+          <w:sz w:val="22"/>
+          <w:szCs w:val="22"/>
+        </w:rPr>
+        <w:t xml:space="preserve">Impression papier du bordereau (liste des colis embarqués sur un bus) directement depuis l'écran de chargement, en un clic, sans attendre un rapport.</w:t>
       </w:r>
     </w:p>
     <w:p>
@@ -678,7 +704,7 @@
           <w:sz w:val="22"/>
           <w:szCs w:val="22"/>
         </w:rPr>
-        <w:t xml:space="preserve">Manifeste colis : depuis les rapports (onglet Colis autonomes), impression PDF ou export Excel de la liste des envois — date, référence, gares, expéditeur/destinataire et téléphones, natures, poids, pièces, montant, statut — filtrée par statut et gare de départ.</w:t>
+        <w:t xml:space="preserve">Manifeste colis : depuis les rapports (onglet Colis autonomes), impression PDF ou export Excel de la liste des envois — date, référence, gares, expéditeur/destinataire et téléphones, natures, poids, pièces, montant, statut, bus du convoi — filtrée par statut, gare de départ et bus / véhicule du convoi.</w:t>
       </w:r>
     </w:p>
     <w:p>
@@ -808,7 +834,192 @@
           <w:sz w:val="22"/>
           <w:szCs w:val="22"/>
         </w:rPr>
-        <w:t xml:space="preserve">À chaque étape du voyage, le personnel fait avancer le statut du colis d'un simple bouton ; le système horodate l'opération et envoie le SMS correspondant. À l'arrivée, la remise se fait contre référence ou scan du QR, après vérification de l'identité du destinataire.</w:t>
+        <w:t xml:space="preserve">À chaque étape du voyage, le personnel fait avancer le statut du colis par scan du code QR / code-barres ou saisie manuelle de la référence (aucune connexion permanente requise) ; le système horodate l'opération et envoie le SMS correspondant. À l'arrivée, la remise se fait contre référence ou scan du QR, après vérification de l'identité du destinataire.</w:t>
+      </w:r>
+    </w:p>
+    <w:p>
+      <w:pPr>
+        <w:pStyle w:val="Heading2"/>
+        <w:spacing w:after="140" w:before="260"/>
+      </w:pPr>
+      <w:r>
+        <w:rPr>
+          <w:b/>
+          <w:bCs/>
+          <w:color w:val="0E9F8A"/>
+          <w:sz w:val="24"/>
+          <w:szCs w:val="24"/>
+        </w:rPr>
+        <w:t xml:space="preserve">2.4 Livraison à domicile (option)</w:t>
+      </w:r>
+    </w:p>
+    <w:p>
+      <w:pPr>
+        <w:spacing w:after="140" w:line="300"/>
+        <w:jc w:val="both"/>
+      </w:pPr>
+      <w:r>
+        <w:rPr>
+          <w:sz w:val="22"/>
+          <w:szCs w:val="22"/>
+        </w:rPr>
+        <w:t xml:space="preserve">Au-delà de la remise en gare, vos clients peuvent faire livrer leur colis directement à domicile, grâce au réseau de livreurs indépendants de Tibus Ride (moto, tricycle, voiture selon le volume et la zone). Cette option est indépendante du module D et s'active séparément.</w:t>
+      </w:r>
+    </w:p>
+    <w:p>
+      <w:pPr>
+        <w:pStyle w:val="ListParagraph"/>
+        <w:numPr>
+          <w:ilvl w:val="0"/>
+          <w:numId w:val="2"/>
+        </w:numPr>
+        <w:spacing w:after="90" w:line="290"/>
+      </w:pPr>
+      <w:r>
+        <w:rPr>
+          <w:b/>
+          <w:bCs/>
+          <w:sz w:val="22"/>
+          <w:szCs w:val="22"/>
+        </w:rPr>
+        <w:t xml:space="preserve">Commande sans compte — </w:t>
+      </w:r>
+      <w:r>
+        <w:rPr>
+          <w:sz w:val="22"/>
+          <w:szCs w:val="22"/>
+        </w:rPr>
+        <w:t xml:space="preserve">Depuis le suivi de son colis (application ou lien web), le destinataire choisit son adresse et le véhicule souhaité, sans création de compte : le code du colis suffit à lier la commande.</w:t>
+      </w:r>
+    </w:p>
+    <w:p>
+      <w:pPr>
+        <w:pStyle w:val="ListParagraph"/>
+        <w:numPr>
+          <w:ilvl w:val="0"/>
+          <w:numId w:val="2"/>
+        </w:numPr>
+        <w:spacing w:after="90" w:line="290"/>
+      </w:pPr>
+      <w:r>
+        <w:rPr>
+          <w:b/>
+          <w:bCs/>
+          <w:sz w:val="22"/>
+          <w:szCs w:val="22"/>
+        </w:rPr>
+        <w:t xml:space="preserve">Suivi temps réel — </w:t>
+      </w:r>
+      <w:r>
+        <w:rPr>
+          <w:sz w:val="22"/>
+          <w:szCs w:val="22"/>
+        </w:rPr>
+        <w:t xml:space="preserve">Position et heure d'arrivée estimée du livreur affichées jusqu'à la remise, avec contact direct et notation du livreur en fin de course.</w:t>
+      </w:r>
+    </w:p>
+    <w:p>
+      <w:pPr>
+        <w:pStyle w:val="ListParagraph"/>
+        <w:numPr>
+          <w:ilvl w:val="0"/>
+          <w:numId w:val="2"/>
+        </w:numPr>
+        <w:spacing w:after="90" w:line="290"/>
+      </w:pPr>
+      <w:r>
+        <w:rPr>
+          <w:b/>
+          <w:bCs/>
+          <w:sz w:val="22"/>
+          <w:szCs w:val="22"/>
+        </w:rPr>
+        <w:t xml:space="preserve">Réseau géré par Tibus — </w:t>
+      </w:r>
+      <w:r>
+        <w:rPr>
+          <w:sz w:val="22"/>
+          <w:szCs w:val="22"/>
+        </w:rPr>
+        <w:t xml:space="preserve">Recrutement, validation et paiement des livreurs entièrement pris en charge par la plateforme Tibus Ride : aucune gestion RH supplémentaire pour votre compagnie.</w:t>
+      </w:r>
+    </w:p>
+    <w:p>
+      <w:pPr>
+        <w:pStyle w:val="ListParagraph"/>
+        <w:numPr>
+          <w:ilvl w:val="0"/>
+          <w:numId w:val="2"/>
+        </w:numPr>
+        <w:spacing w:after="90" w:line="290"/>
+      </w:pPr>
+      <w:r>
+        <w:rPr>
+          <w:b/>
+          <w:bCs/>
+          <w:sz w:val="22"/>
+          <w:szCs w:val="22"/>
+        </w:rPr>
+        <w:t xml:space="preserve">Disponibilité par zone — </w:t>
+      </w:r>
+      <w:r>
+        <w:rPr>
+          <w:sz w:val="22"/>
+          <w:szCs w:val="22"/>
+        </w:rPr>
+        <w:t xml:space="preserve">L'option n'est proposée que dans les villes où le réseau de livreurs Tibus Ride est actif ; elle complète la remise en gare sans la remplacer.</w:t>
+      </w:r>
+    </w:p>
+    <w:p>
+      <w:pPr>
+        <w:pStyle w:val="ListParagraph"/>
+        <w:numPr>
+          <w:ilvl w:val="0"/>
+          <w:numId w:val="2"/>
+        </w:numPr>
+        <w:spacing w:after="90" w:line="290"/>
+      </w:pPr>
+      <w:r>
+        <w:rPr>
+          <w:b/>
+          <w:bCs/>
+          <w:sz w:val="22"/>
+          <w:szCs w:val="22"/>
+        </w:rPr>
+        <w:t xml:space="preserve">Application dédiée client — </w:t>
+      </w:r>
+      <w:r>
+        <w:rPr>
+          <w:sz w:val="22"/>
+          <w:szCs w:val="22"/>
+        </w:rPr>
+        <w:t xml:space="preserve">Les clients réguliers commandent aussi une livraison directement depuis leur compte Tibus (application courrier), pour un suivi centralisé de tous leurs envois, sans ressaisir leurs informations à chaque commande.</w:t>
+      </w:r>
+    </w:p>
+    <w:p>
+      <w:pPr>
+        <w:pStyle w:val="ListParagraph"/>
+        <w:numPr>
+          <w:ilvl w:val="0"/>
+          <w:numId w:val="2"/>
+        </w:numPr>
+        <w:spacing w:after="90" w:line="290"/>
+      </w:pPr>
+      <w:r>
+        <w:rPr>
+          <w:b/>
+          <w:bCs/>
+          <w:sz w:val="22"/>
+          <w:szCs w:val="22"/>
+        </w:rPr>
+        <w:t xml:space="preserve">Livreurs fiables — </w:t>
+      </w:r>
+      <w:r>
+        <w:rPr>
+          <w:sz w:val="22"/>
+          <w:szCs w:val="22"/>
+        </w:rPr>
+        <w:t xml:space="preserve">Chaque livreur voit sa rémunération et son solde avant d'accepter une course, ce qui favorise un réseau de livreurs actifs et disponibles sur le terrain.</w:t>
       </w:r>
     </w:p>
     <w:p>
@@ -1296,6 +1507,32 @@
           <w:szCs w:val="22"/>
         </w:rPr>
         <w:t xml:space="preserve">Démarrage possible sur une ou deux gares pilotes avant généralisation au réseau.</w:t>
+      </w:r>
+    </w:p>
+    <w:p>
+      <w:pPr>
+        <w:pStyle w:val="ListParagraph"/>
+        <w:numPr>
+          <w:ilvl w:val="0"/>
+          <w:numId w:val="2"/>
+        </w:numPr>
+        <w:spacing w:after="90" w:line="290"/>
+      </w:pPr>
+      <w:r>
+        <w:rPr>
+          <w:b/>
+          <w:bCs/>
+          <w:sz w:val="22"/>
+          <w:szCs w:val="22"/>
+        </w:rPr>
+        <w:t xml:space="preserve">Applications dédiées — </w:t>
+      </w:r>
+      <w:r>
+        <w:rPr>
+          <w:sz w:val="22"/>
+          <w:szCs w:val="22"/>
+        </w:rPr>
+        <w:t xml:space="preserve">guichet agent (mobile Android, avec scan, reçu, étiquette et bordereau), suivi client et commande de livraison (application et web), application livreur (mobile, avec rémunération et solde visibles avant course) — chacune accessible immédiatement après activation.</w:t>
       </w:r>
     </w:p>
     <w:p>
@@ -1692,6 +1929,74 @@
                 <w:szCs w:val="20"/>
               </w:rPr>
               <w:t xml:space="preserve">—</w:t>
+            </w:r>
+          </w:p>
+        </w:tc>
+      </w:tr>
+      <w:tr>
+        <w:tc>
+          <w:tcPr>
+            <w:tcW w:type="dxa" w:w="4600"/>
+            <w:tcMar>
+              <w:top w:type="dxa" w:w="80"/>
+              <w:left w:type="dxa" w:w="110"/>
+              <w:bottom w:type="dxa" w:w="80"/>
+              <w:right w:type="dxa" w:w="110"/>
+            </w:tcMar>
+          </w:tcPr>
+          <w:p>
+            <w:r>
+              <w:rPr>
+                <w:b w:val="false"/>
+                <w:bCs w:val="false"/>
+                <w:sz w:val="20"/>
+                <w:szCs w:val="20"/>
+              </w:rPr>
+              <w:t xml:space="preserve">Option Livraison à domicile (réseau livreurs Tibus Ride)</w:t>
+            </w:r>
+          </w:p>
+        </w:tc>
+        <w:tc>
+          <w:tcPr>
+            <w:tcW w:type="dxa" w:w="2400"/>
+            <w:tcMar>
+              <w:top w:type="dxa" w:w="80"/>
+              <w:left w:type="dxa" w:w="110"/>
+              <w:bottom w:type="dxa" w:w="80"/>
+              <w:right w:type="dxa" w:w="110"/>
+            </w:tcMar>
+          </w:tcPr>
+          <w:p>
+            <w:r>
+              <w:rPr>
+                <w:b w:val="false"/>
+                <w:bCs w:val="false"/>
+                <w:sz w:val="20"/>
+                <w:szCs w:val="20"/>
+              </w:rPr>
+              <w:t xml:space="preserve">—</w:t>
+            </w:r>
+          </w:p>
+        </w:tc>
+        <w:tc>
+          <w:tcPr>
+            <w:tcW w:type="dxa" w:w="2400"/>
+            <w:tcMar>
+              <w:top w:type="dxa" w:w="80"/>
+              <w:left w:type="dxa" w:w="110"/>
+              <w:bottom w:type="dxa" w:w="80"/>
+              <w:right w:type="dxa" w:w="110"/>
+            </w:tcMar>
+          </w:tcPr>
+          <w:p>
+            <w:r>
+              <w:rPr>
+                <w:b w:val="false"/>
+                <w:bCs w:val="false"/>
+                <w:sz w:val="20"/>
+                <w:szCs w:val="20"/>
+              </w:rPr>
+              <w:t xml:space="preserve">Commission par course</w:t>
             </w:r>
           </w:p>
         </w:tc>

</xml_diff>